<commit_message>
Add reference-architecture figure as Appendix B
Embed sales/assets/appendix_a_architecture.png as a captioned appendix
figure in the enterprise DOCX, with a describing paragraph (dashboard,
stdlib control plane, and the persistence/execution/identity seams). The
Markdown source carries the same appendix via standard image syntax.

Co-Authored-By: Claude Opus 4.8 <noreply@anthropic.com>
Claude-Session: https://claude.ai/code/session_01PHafS3wswzEsP1U9wQxe55
</commit_message>
<xml_diff>
--- a/sales/Votal_CyberRange_RFP_Technical_Specification.docx
+++ b/sales/Votal_CyberRange_RFP_Technical_Specification.docx
@@ -29741,6 +29741,538 @@
     </w:p>
     <w:p>
       <w:pPr>
+        <w:pStyle w:val="Heading1"/>
+        <w:keepNext/>
+        <w:pBdr>
+          <w:bottom w:val="single" w:color="D8E1E8" w:sz="6"/>
+        </w:pBdr>
+        <w:spacing w:before="360" w:after="70" w:line="288"/>
+      </w:pPr>
+      <w:r>
+        <w:rPr>
+          <w:b/>
+          <w:bCs/>
+          <w:color w:val="0F3B57"/>
+          <w:sz w:val="27"/>
+          <w:szCs w:val="27"/>
+          <w:rFonts w:ascii="Calibri" w:cs="Calibri" w:eastAsia="Calibri" w:hAnsi="Calibri"/>
+        </w:rPr>
+        <w:t xml:space="preserve">Appendix B — Reference architecture</w:t>
+      </w:r>
+    </w:p>
+    <w:p>
+      <w:pPr>
+        <w:spacing w:before="0" w:after="130" w:line="288"/>
+        <w:jc w:val="left"/>
+      </w:pPr>
+      <w:r>
+        <w:rPr>
+          <w:b w:val="false"/>
+          <w:bCs w:val="false"/>
+          <w:i w:val="false"/>
+          <w:iCs w:val="false"/>
+          <w:color w:val="22313D"/>
+          <w:sz w:val="20"/>
+          <w:szCs w:val="20"/>
+          <w:rFonts w:ascii="Calibri" w:cs="Calibri" w:eastAsia="Calibri" w:hAnsi="Calibri"/>
+        </w:rPr>
+        <w:t xml:space="preserve">Figure B-1 shows the CyberRange reference architecture. An operator web</w:t>
+      </w:r>
+    </w:p>
+    <w:p>
+      <w:pPr>
+        <w:spacing w:before="0" w:after="130" w:line="288"/>
+        <w:jc w:val="left"/>
+      </w:pPr>
+      <w:r>
+        <w:rPr>
+          <w:b w:val="false"/>
+          <w:bCs w:val="false"/>
+          <w:i w:val="false"/>
+          <w:iCs w:val="false"/>
+          <w:color w:val="22313D"/>
+          <w:sz w:val="20"/>
+          <w:szCs w:val="20"/>
+          <w:rFonts w:ascii="Calibri" w:cs="Calibri" w:eastAsia="Calibri" w:hAnsi="Calibri"/>
+        </w:rPr>
+        <w:t xml:space="preserve">dashboard (no build step, no client install) drives a stdlib HTTP control plane</w:t>
+      </w:r>
+    </w:p>
+    <w:p>
+      <w:pPr>
+        <w:spacing w:before="0" w:after="130" w:line="288"/>
+        <w:jc w:val="left"/>
+      </w:pPr>
+      <w:r>
+        <w:rPr>
+          <w:b w:val="false"/>
+          <w:bCs w:val="false"/>
+          <w:i w:val="false"/>
+          <w:iCs w:val="false"/>
+          <w:color w:val="22313D"/>
+          <w:sz w:val="20"/>
+          <w:szCs w:val="20"/>
+          <w:rFonts w:ascii="Calibri" w:cs="Calibri" w:eastAsia="Calibri" w:hAnsi="Calibri"/>
+        </w:rPr>
+        <w:t xml:space="preserve">over REST/JSON. The control plane carries the catalog, lifecycle state machine,</w:t>
+      </w:r>
+    </w:p>
+    <w:p>
+      <w:pPr>
+        <w:spacing w:before="0" w:after="130" w:line="288"/>
+        <w:jc w:val="left"/>
+      </w:pPr>
+      <w:r>
+        <w:rPr>
+          <w:b w:val="false"/>
+          <w:bCs w:val="false"/>
+          <w:i w:val="false"/>
+          <w:iCs w:val="false"/>
+          <w:color w:val="22313D"/>
+          <w:sz w:val="20"/>
+          <w:szCs w:val="20"/>
+          <w:rFonts w:ascii="Calibri" w:cs="Calibri" w:eastAsia="Calibri" w:hAnsi="Calibri"/>
+        </w:rPr>
+        <w:t xml:space="preserve">RBAC, scoring, detection engine, reporting, and the append-only audit ledger,</w:t>
+      </w:r>
+    </w:p>
+    <w:p>
+      <w:pPr>
+        <w:spacing w:before="0" w:after="130" w:line="288"/>
+        <w:jc w:val="left"/>
+      </w:pPr>
+      <w:r>
+        <w:rPr>
+          <w:b w:val="false"/>
+          <w:bCs w:val="false"/>
+          <w:i w:val="false"/>
+          <w:iCs w:val="false"/>
+          <w:color w:val="22313D"/>
+          <w:sz w:val="20"/>
+          <w:szCs w:val="20"/>
+          <w:rFonts w:ascii="Calibri" w:cs="Calibri" w:eastAsia="Calibri" w:hAnsi="Calibri"/>
+        </w:rPr>
+        <w:t xml:space="preserve">and it sits behind three deliberate portability seams, each of which is an</w:t>
+      </w:r>
+    </w:p>
+    <w:p>
+      <w:pPr>
+        <w:spacing w:before="0" w:after="130" w:line="288"/>
+        <w:jc w:val="left"/>
+      </w:pPr>
+      <w:r>
+        <w:rPr>
+          <w:b w:val="false"/>
+          <w:bCs w:val="false"/>
+          <w:i w:val="false"/>
+          <w:iCs w:val="false"/>
+          <w:color w:val="22313D"/>
+          <w:sz w:val="20"/>
+          <w:szCs w:val="20"/>
+          <w:rFonts w:ascii="Calibri" w:cs="Calibri" w:eastAsia="Calibri" w:hAnsi="Calibri"/>
+        </w:rPr>
+        <w:t xml:space="preserve">interface swap rather than a redesign:</w:t>
+      </w:r>
+    </w:p>
+    <w:p>
+      <w:pPr>
+        <w:pStyle w:val="ListParagraph"/>
+        <w:numPr>
+          <w:ilvl w:val="0"/>
+          <w:numId w:val="1"/>
+        </w:numPr>
+        <w:spacing w:before="30" w:after="70" w:line="276"/>
+      </w:pPr>
+      <w:r>
+        <w:rPr>
+          <w:b/>
+          <w:bCs/>
+          <w:i w:val="false"/>
+          <w:iCs w:val="false"/>
+          <w:color w:val="22313D"/>
+          <w:sz w:val="20"/>
+          <w:szCs w:val="20"/>
+          <w:rFonts w:ascii="Calibri" w:cs="Calibri" w:eastAsia="Calibri" w:hAnsi="Calibri"/>
+        </w:rPr>
+        <w:t xml:space="preserve">Persistence</w:t>
+      </w:r>
+      <w:r>
+        <w:rPr>
+          <w:b w:val="false"/>
+          <w:bCs w:val="false"/>
+          <w:i w:val="false"/>
+          <w:iCs w:val="false"/>
+          <w:color w:val="22313D"/>
+          <w:sz w:val="20"/>
+          <w:szCs w:val="20"/>
+          <w:rFonts w:ascii="Calibri" w:cs="Calibri" w:eastAsia="Calibri" w:hAnsi="Calibri"/>
+        </w:rPr>
+        <w:t xml:space="preserve"> — SQLite (evaluation) and PostgreSQL/Supabase (production) are</w:t>
+      </w:r>
+    </w:p>
+    <w:p>
+      <w:pPr>
+        <w:spacing w:before="0" w:after="130" w:line="288"/>
+        <w:jc w:val="left"/>
+      </w:pPr>
+      <w:r>
+        <w:rPr>
+          <w:b w:val="false"/>
+          <w:bCs w:val="false"/>
+          <w:i w:val="false"/>
+          <w:iCs w:val="false"/>
+          <w:color w:val="22313D"/>
+          <w:sz w:val="20"/>
+          <w:szCs w:val="20"/>
+          <w:rFonts w:ascii="Calibri" w:cs="Calibri" w:eastAsia="Calibri" w:hAnsi="Calibri"/>
+        </w:rPr>
+        <w:t xml:space="preserve">interchangeable by connection string.</w:t>
+      </w:r>
+    </w:p>
+    <w:p>
+      <w:pPr>
+        <w:pStyle w:val="ListParagraph"/>
+        <w:numPr>
+          <w:ilvl w:val="0"/>
+          <w:numId w:val="1"/>
+        </w:numPr>
+        <w:spacing w:before="30" w:after="70" w:line="276"/>
+      </w:pPr>
+      <w:r>
+        <w:rPr>
+          <w:b/>
+          <w:bCs/>
+          <w:i w:val="false"/>
+          <w:iCs w:val="false"/>
+          <w:color w:val="22313D"/>
+          <w:sz w:val="20"/>
+          <w:szCs w:val="20"/>
+          <w:rFonts w:ascii="Calibri" w:cs="Calibri" w:eastAsia="Calibri" w:hAnsi="Calibri"/>
+        </w:rPr>
+        <w:t xml:space="preserve">Execution</w:t>
+      </w:r>
+      <w:r>
+        <w:rPr>
+          <w:b w:val="false"/>
+          <w:bCs w:val="false"/>
+          <w:i w:val="false"/>
+          <w:iCs w:val="false"/>
+          <w:color w:val="22313D"/>
+          <w:sz w:val="20"/>
+          <w:szCs w:val="20"/>
+          <w:rFonts w:ascii="Calibri" w:cs="Calibri" w:eastAsia="Calibri" w:hAnsi="Calibri"/>
+        </w:rPr>
+        <w:t xml:space="preserve"> — a container-backed adapter </w:t>
+      </w:r>
+      <w:r>
+        <w:rPr>
+          <w:b/>
+          <w:bCs/>
+          <w:i w:val="false"/>
+          <w:iCs w:val="false"/>
+          <w:color w:val="1E7A4D"/>
+          <w:sz w:val="20"/>
+          <w:szCs w:val="20"/>
+          <w:rFonts w:ascii="Calibri" w:cs="Calibri" w:eastAsia="Calibri" w:hAnsi="Calibri"/>
+        </w:rPr>
+        <w:t xml:space="preserve">(GA)</w:t>
+      </w:r>
+      <w:r>
+        <w:rPr>
+          <w:b w:val="false"/>
+          <w:bCs w:val="false"/>
+          <w:i w:val="false"/>
+          <w:iCs w:val="false"/>
+          <w:color w:val="22313D"/>
+          <w:sz w:val="20"/>
+          <w:szCs w:val="20"/>
+          <w:rFonts w:ascii="Calibri" w:cs="Calibri" w:eastAsia="Calibri" w:hAnsi="Calibri"/>
+        </w:rPr>
+        <w:t xml:space="preserve"> and a hypervisor-backed VM/AD</w:t>
+      </w:r>
+    </w:p>
+    <w:p>
+      <w:pPr>
+        <w:spacing w:before="0" w:after="130" w:line="288"/>
+        <w:jc w:val="left"/>
+      </w:pPr>
+      <w:r>
+        <w:rPr>
+          <w:b w:val="false"/>
+          <w:bCs w:val="false"/>
+          <w:i w:val="false"/>
+          <w:iCs w:val="false"/>
+          <w:color w:val="22313D"/>
+          <w:sz w:val="20"/>
+          <w:szCs w:val="20"/>
+          <w:rFonts w:ascii="Calibri" w:cs="Calibri" w:eastAsia="Calibri" w:hAnsi="Calibri"/>
+        </w:rPr>
+        <w:t xml:space="preserve">adapter </w:t>
+      </w:r>
+      <w:r>
+        <w:rPr>
+          <w:b/>
+          <w:bCs/>
+          <w:i w:val="false"/>
+          <w:iCs w:val="false"/>
+          <w:color w:val="B06A00"/>
+          <w:sz w:val="20"/>
+          <w:szCs w:val="20"/>
+          <w:rFonts w:ascii="Calibri" w:cs="Calibri" w:eastAsia="Calibri" w:hAnsi="Calibri"/>
+        </w:rPr>
+        <w:t xml:space="preserve">(P1)</w:t>
+      </w:r>
+      <w:r>
+        <w:rPr>
+          <w:b w:val="false"/>
+          <w:bCs w:val="false"/>
+          <w:i w:val="false"/>
+          <w:iCs w:val="false"/>
+          <w:color w:val="22313D"/>
+          <w:sz w:val="20"/>
+          <w:szCs w:val="20"/>
+          <w:rFonts w:ascii="Calibri" w:cs="Calibri" w:eastAsia="Calibri" w:hAnsi="Calibri"/>
+        </w:rPr>
+        <w:t xml:space="preserve"> plug into the same execution interface; modules degrade to a</w:t>
+      </w:r>
+    </w:p>
+    <w:p>
+      <w:pPr>
+        <w:spacing w:before="0" w:after="130" w:line="288"/>
+        <w:jc w:val="left"/>
+      </w:pPr>
+      <w:r>
+        <w:rPr>
+          <w:b w:val="false"/>
+          <w:bCs w:val="false"/>
+          <w:i w:val="false"/>
+          <w:iCs w:val="false"/>
+          <w:color w:val="22313D"/>
+          <w:sz w:val="20"/>
+          <w:szCs w:val="20"/>
+          <w:rFonts w:ascii="Calibri" w:cs="Calibri" w:eastAsia="Calibri" w:hAnsi="Calibri"/>
+        </w:rPr>
+        <w:t xml:space="preserve">simulated adapter when no execution host is present.</w:t>
+      </w:r>
+    </w:p>
+    <w:p>
+      <w:pPr>
+        <w:pStyle w:val="ListParagraph"/>
+        <w:numPr>
+          <w:ilvl w:val="0"/>
+          <w:numId w:val="1"/>
+        </w:numPr>
+        <w:spacing w:before="30" w:after="70" w:line="276"/>
+      </w:pPr>
+      <w:r>
+        <w:rPr>
+          <w:b/>
+          <w:bCs/>
+          <w:i w:val="false"/>
+          <w:iCs w:val="false"/>
+          <w:color w:val="22313D"/>
+          <w:sz w:val="20"/>
+          <w:szCs w:val="20"/>
+          <w:rFonts w:ascii="Calibri" w:cs="Calibri" w:eastAsia="Calibri" w:hAnsi="Calibri"/>
+        </w:rPr>
+        <w:t xml:space="preserve">Identity</w:t>
+      </w:r>
+      <w:r>
+        <w:rPr>
+          <w:b w:val="false"/>
+          <w:bCs w:val="false"/>
+          <w:i w:val="false"/>
+          <w:iCs w:val="false"/>
+          <w:color w:val="22313D"/>
+          <w:sz w:val="20"/>
+          <w:szCs w:val="20"/>
+          <w:rFonts w:ascii="Calibri" w:cs="Calibri" w:eastAsia="Calibri" w:hAnsi="Calibri"/>
+        </w:rPr>
+        <w:t xml:space="preserve"> — local login </w:t>
+      </w:r>
+      <w:r>
+        <w:rPr>
+          <w:b/>
+          <w:bCs/>
+          <w:i w:val="false"/>
+          <w:iCs w:val="false"/>
+          <w:color w:val="1E7A4D"/>
+          <w:sz w:val="20"/>
+          <w:szCs w:val="20"/>
+          <w:rFonts w:ascii="Calibri" w:cs="Calibri" w:eastAsia="Calibri" w:hAnsi="Calibri"/>
+        </w:rPr>
+        <w:t xml:space="preserve">(GA)</w:t>
+      </w:r>
+      <w:r>
+        <w:rPr>
+          <w:b w:val="false"/>
+          <w:bCs w:val="false"/>
+          <w:i w:val="false"/>
+          <w:iCs w:val="false"/>
+          <w:color w:val="22313D"/>
+          <w:sz w:val="20"/>
+          <w:szCs w:val="20"/>
+          <w:rFonts w:ascii="Calibri" w:cs="Calibri" w:eastAsia="Calibri" w:hAnsi="Calibri"/>
+        </w:rPr>
+        <w:t xml:space="preserve"> and SSO/OIDC </w:t>
+      </w:r>
+      <w:r>
+        <w:rPr>
+          <w:b/>
+          <w:bCs/>
+          <w:i w:val="false"/>
+          <w:iCs w:val="false"/>
+          <w:color w:val="B06A00"/>
+          <w:sz w:val="20"/>
+          <w:szCs w:val="20"/>
+          <w:rFonts w:ascii="Calibri" w:cs="Calibri" w:eastAsia="Calibri" w:hAnsi="Calibri"/>
+        </w:rPr>
+        <w:t xml:space="preserve">(P1)</w:t>
+      </w:r>
+      <w:r>
+        <w:rPr>
+          <w:b w:val="false"/>
+          <w:bCs w:val="false"/>
+          <w:i w:val="false"/>
+          <w:iCs w:val="false"/>
+          <w:color w:val="22313D"/>
+          <w:sz w:val="20"/>
+          <w:szCs w:val="20"/>
+          <w:rFonts w:ascii="Calibri" w:cs="Calibri" w:eastAsia="Calibri" w:hAnsi="Calibri"/>
+        </w:rPr>
+        <w:t xml:space="preserve"> sit at the edge with the</w:t>
+      </w:r>
+    </w:p>
+    <w:p>
+      <w:pPr>
+        <w:spacing w:before="0" w:after="130" w:line="288"/>
+        <w:jc w:val="left"/>
+      </w:pPr>
+      <w:r>
+        <w:rPr>
+          <w:b w:val="false"/>
+          <w:bCs w:val="false"/>
+          <w:i w:val="false"/>
+          <w:iCs w:val="false"/>
+          <w:color w:val="22313D"/>
+          <w:sz w:val="20"/>
+          <w:szCs w:val="20"/>
+          <w:rFonts w:ascii="Calibri" w:cs="Calibri" w:eastAsia="Calibri" w:hAnsi="Calibri"/>
+        </w:rPr>
+        <w:t xml:space="preserve">RBAC layer unchanged.</w:t>
+      </w:r>
+    </w:p>
+    <w:p>
+      <w:pPr>
+        <w:spacing w:before="0" w:after="130" w:line="288"/>
+        <w:jc w:val="left"/>
+      </w:pPr>
+      <w:r>
+        <w:rPr>
+          <w:b w:val="false"/>
+          <w:bCs w:val="false"/>
+          <w:i w:val="false"/>
+          <w:iCs w:val="false"/>
+          <w:color w:val="22313D"/>
+          <w:sz w:val="20"/>
+          <w:szCs w:val="20"/>
+          <w:rFonts w:ascii="Calibri" w:cs="Calibri" w:eastAsia="Calibri" w:hAnsi="Calibri"/>
+        </w:rPr>
+        <w:t xml:space="preserve">Telemetry flows to an internal synchronized timeline and, optionally, to a real</w:t>
+      </w:r>
+    </w:p>
+    <w:p>
+      <w:pPr>
+        <w:spacing w:before="0" w:after="130" w:line="288"/>
+        <w:jc w:val="left"/>
+      </w:pPr>
+      <w:r>
+        <w:rPr>
+          <w:b w:val="false"/>
+          <w:bCs w:val="false"/>
+          <w:i w:val="false"/>
+          <w:iCs w:val="false"/>
+          <w:color w:val="22313D"/>
+          <w:sz w:val="20"/>
+          <w:szCs w:val="20"/>
+          <w:rFonts w:ascii="Calibri" w:cs="Calibri" w:eastAsia="Calibri" w:hAnsi="Calibri"/>
+        </w:rPr>
+        <w:t xml:space="preserve">SIEM (bundled Wazuh; Elastic/Sentinel/Splunk via the normalized contract).</w:t>
+      </w:r>
+    </w:p>
+    <w:p>
+      <w:r>
+        <w:br w:type="page"/>
+      </w:r>
+    </w:p>
+    <w:p>
+      <w:pPr>
+        <w:spacing w:before="60" w:after="120"/>
+        <w:jc w:val="center"/>
+      </w:pPr>
+      <w:r>
+        <w:drawing>
+          <wp:inline distT="0" distB="0" distL="0" distR="0">
+            <wp:extent cx="5486400" cy="6010275"/>
+            <wp:effectExtent t="0" r="0" b="0" l="0"/>
+            <wp:docPr id="1" name="" descr="" title=""/>
+            <wp:cNvGraphicFramePr>
+              <a:graphicFrameLocks xmlns:a="http://schemas.openxmlformats.org/drawingml/2006/main" noChangeAspect="1"/>
+            </wp:cNvGraphicFramePr>
+            <a:graphic xmlns:a="http://schemas.openxmlformats.org/drawingml/2006/main">
+              <a:graphicData uri="http://schemas.openxmlformats.org/drawingml/2006/picture">
+                <pic:pic xmlns:pic="http://schemas.openxmlformats.org/drawingml/2006/picture">
+                  <pic:nvPicPr>
+                    <pic:cNvPr id="0" name="" descr=""/>
+                    <pic:cNvPicPr>
+                      <a:picLocks noChangeAspect="1" noChangeArrowheads="1"/>
+                    </pic:cNvPicPr>
+                  </pic:nvPicPr>
+                  <pic:blipFill>
+                    <a:blip r:embed="rId9" cstate="none"/>
+                    <a:srcRect/>
+                    <a:stretch>
+                      <a:fillRect/>
+                    </a:stretch>
+                  </pic:blipFill>
+                  <pic:spPr bwMode="auto">
+                    <a:xfrm>
+                      <a:off x="0" y="0"/>
+                      <a:ext cx="5486400" cy="6010275"/>
+                    </a:xfrm>
+                    <a:prstGeom prst="rect">
+                      <a:avLst/>
+                    </a:prstGeom>
+                  </pic:spPr>
+                </pic:pic>
+              </a:graphicData>
+            </a:graphic>
+          </wp:inline>
+        </w:drawing>
+      </w:r>
+    </w:p>
+    <w:p>
+      <w:pPr>
+        <w:pBdr>
+          <w:top w:val="single" w:color="D8E1E8" w:sz="3"/>
+        </w:pBdr>
+        <w:spacing w:after="160"/>
+        <w:jc w:val="center"/>
+      </w:pPr>
+      <w:r>
+        <w:rPr>
+          <w:i/>
+          <w:iCs/>
+          <w:color w:val="667783"/>
+          <w:sz w:val="17"/>
+          <w:szCs w:val="17"/>
+          <w:rFonts w:ascii="Calibri" w:cs="Calibri" w:eastAsia="Calibri" w:hAnsi="Calibri"/>
+        </w:rPr>
+        <w:t xml:space="preserve">Figure B-1 — CyberRange reference architecture: operator dashboard, stdlib control plane, and the persistence, execution, and telemetry seams.</w:t>
+      </w:r>
+    </w:p>
+    <w:p>
+      <w:pPr>
         <w:spacing w:before="0" w:after="130" w:line="288"/>
         <w:jc w:val="left"/>
       </w:pPr>

</xml_diff>